<commit_message>
rename: HCP Targeting & Commercial Intelligence — Diabetes Portfolio (all files)
</commit_message>
<xml_diff>
--- a/AI_ML_Extension_Blueprint.docx
+++ b/AI_ML_Extension_Blueprint.docx
@@ -51,7 +51,7 @@
           <w:sz w:val="22"/>
           <w:szCs w:val="22"/>
         </w:rPr>
-        <w:t xml:space="preserve">HCP Targeting &amp; Brand Performance Analytics — Diabetes Portfolio</w:t>
+        <w:t>HCP Targeting &amp; Commercial Intelligence — Diabetes Portfolio — Diabetes Portfolio</w:t>
       </w:r>
     </w:p>
     <w:p>
@@ -11050,7 +11050,7 @@
         <w:sz w:val="18"/>
         <w:szCs w:val="18"/>
       </w:rPr>
-      <w:t xml:space="preserve">HCP Targeting &amp; Brand Performance Analytics — Diabetes</w:t>
+      <w:t>HCP Targeting &amp; Commercial Intelligence — Diabetes Portfolio — Diabetes</w:t>
     </w:r>
     <w:r>
       <w:rPr>

</xml_diff>